<commit_message>
added hagerstown, updated format of header in highest and best use doc
</commit_message>
<xml_diff>
--- a/highest_and_best_use.docx
+++ b/highest_and_best_use.docx
@@ -6,27 +6,25 @@
       <w:pPr>
         <w:pStyle w:val="Heading1"/>
         <w:pBdr>
-          <w:top w:val="single" w:sz="4" w:space="1" w:color="auto"/>
-          <w:left w:val="single" w:sz="4" w:space="4" w:color="auto"/>
-          <w:bottom w:val="single" w:sz="4" w:space="1" w:color="auto"/>
-          <w:right w:val="single" w:sz="4" w:space="4" w:color="auto"/>
+          <w:top w:val="single" w:sz="4" w:space="0" w:color="000000"/>
+          <w:left w:val="single" w:sz="4" w:space="0" w:color="000000"/>
+          <w:bottom w:val="single" w:sz="4" w:space="0" w:color="000000"/>
+          <w:right w:val="single" w:sz="4" w:space="0" w:color="000000"/>
         </w:pBdr>
-        <w:shd w:val="clear" w:color="auto" w:fill="A6A6A6" w:themeFill="background1" w:themeFillShade="A6"/>
+        <w:shd w:val="clear" w:color="auto" w:fill="A6A6A6"/>
         <w:spacing w:before="0" w:after="0"/>
         <w:jc w:val="center"/>
         <w:rPr>
-          <w:rFonts w:ascii="Times New Roman" w:hAnsi="Times New Roman" w:cs="Times New Roman"/>
+          <w:rFonts w:ascii="Times New Roman" w:hAnsi="Times New Roman"/>
           <w:sz w:val="28"/>
-          <w:szCs w:val="28"/>
         </w:rPr>
       </w:pPr>
       <w:bookmarkStart w:id="0" w:name="_Toc109389422"/>
       <w:bookmarkStart w:id="1" w:name="_Toc109389463"/>
       <w:r>
         <w:rPr>
-          <w:rFonts w:ascii="Times New Roman" w:hAnsi="Times New Roman" w:cs="Times New Roman"/>
+          <w:rFonts w:ascii="Times New Roman" w:hAnsi="Times New Roman"/>
           <w:sz w:val="28"/>
-          <w:szCs w:val="28"/>
         </w:rPr>
         <w:t>HIGHEST AND BEST USE</w:t>
       </w:r>
@@ -6901,7 +6899,7 @@
     <w:name w:val="Heading 1 Char"/>
     <w:basedOn w:val="DefaultParagraphFont"/>
     <w:link w:val="Heading1"/>
-    <w:uiPriority w:val="9"/>
+    <w:uiPriority w:val="99"/>
     <w:rsid w:val="00B92F92"/>
     <w:rPr>
       <w:rFonts w:ascii="Arial" w:hAnsi="Arial" w:cs="Arial"/>

</xml_diff>